<commit_message>
Version auf 2.0.0 erhoeht
</commit_message>
<xml_diff>
--- a/data/Preisliste_fertig.docx
+++ b/data/Preisliste_fertig.docx
@@ -206,6 +206,7 @@
                     <w:szCs w:val="28"/>
                   </w:rPr>
                 </w:pPr>
+                <w:proofErr w:type="spellStart"/>
                 <w:r>
                   <w:rPr>
                     <w:rFonts w:ascii="Arial" w:hAnsi="Arial" w:cs="Arial"/>
@@ -214,6 +215,7 @@
                   </w:rPr>
                   <w:t>1 Paar Wienerle</w:t>
                 </w:r>
+                <w:proofErr w:type="spellEnd"/>
               </w:p>
             </w:tc>
           </w:sdtContent>
@@ -245,6 +247,7 @@
                     <w:szCs w:val="28"/>
                   </w:rPr>
                 </w:pPr>
+                <w:proofErr w:type="spellStart"/>
                 <w:r>
                   <w:rPr>
                     <w:rFonts w:ascii="Arial" w:hAnsi="Arial" w:cs="Arial"/>
@@ -253,6 +256,7 @@
                   </w:rPr>
                   <w:t>6,00</w:t>
                 </w:r>
+                <w:proofErr w:type="spellEnd"/>
               </w:p>
             </w:tc>
           </w:sdtContent>
@@ -285,6 +289,7 @@
                     <w:szCs w:val="28"/>
                   </w:rPr>
                 </w:pPr>
+                <w:proofErr w:type="spellStart"/>
                 <w:r>
                   <w:rPr>
                     <w:rFonts w:ascii="Arial" w:hAnsi="Arial" w:cs="Arial"/>
@@ -293,6 +298,7 @@
                   </w:rPr>
                   <w:t>Geräucherte Bratwürste mit Brot (kalt)</w:t>
                 </w:r>
+                <w:proofErr w:type="spellEnd"/>
               </w:p>
             </w:tc>
           </w:sdtContent>
@@ -324,6 +330,7 @@
                     <w:szCs w:val="28"/>
                   </w:rPr>
                 </w:pPr>
+                <w:proofErr w:type="spellStart"/>
                 <w:r>
                   <w:rPr>
                     <w:rFonts w:ascii="Arial" w:hAnsi="Arial" w:cs="Arial"/>
@@ -332,6 +339,7 @@
                   </w:rPr>
                   <w:t>7,00</w:t>
                 </w:r>
+                <w:proofErr w:type="spellEnd"/>
               </w:p>
             </w:tc>
           </w:sdtContent>
@@ -364,6 +372,7 @@
                     <w:szCs w:val="28"/>
                   </w:rPr>
                 </w:pPr>
+                <w:proofErr w:type="spellStart"/>
                 <w:r>
                   <w:rPr>
                     <w:rFonts w:ascii="Arial" w:hAnsi="Arial" w:cs="Arial"/>
@@ -372,6 +381,7 @@
                   </w:rPr>
                   <w:t>Kartoffelsuppe mit Brot</w:t>
                 </w:r>
+                <w:proofErr w:type="spellEnd"/>
               </w:p>
             </w:tc>
           </w:sdtContent>
@@ -403,6 +413,7 @@
                     <w:szCs w:val="28"/>
                   </w:rPr>
                 </w:pPr>
+                <w:proofErr w:type="spellStart"/>
                 <w:r>
                   <w:rPr>
                     <w:rFonts w:ascii="Arial" w:hAnsi="Arial" w:cs="Arial"/>
@@ -411,6 +422,7 @@
                   </w:rPr>
                   <w:t>5,50</w:t>
                 </w:r>
+                <w:proofErr w:type="spellEnd"/>
               </w:p>
             </w:tc>
           </w:sdtContent>
@@ -443,6 +455,7 @@
                     <w:szCs w:val="28"/>
                   </w:rPr>
                 </w:pPr>
+                <w:proofErr w:type="spellStart"/>
                 <w:r>
                   <w:rPr>
                     <w:rFonts w:ascii="Arial" w:hAnsi="Arial" w:cs="Arial"/>
@@ -451,6 +464,7 @@
                   </w:rPr>
                   <w:t>Kartoffelsuppe mit Brot und Wienerle</w:t>
                 </w:r>
+                <w:proofErr w:type="spellEnd"/>
               </w:p>
             </w:tc>
           </w:sdtContent>
@@ -482,6 +496,7 @@
                     <w:szCs w:val="28"/>
                   </w:rPr>
                 </w:pPr>
+                <w:proofErr w:type="spellStart"/>
                 <w:r>
                   <w:rPr>
                     <w:rFonts w:ascii="Arial" w:hAnsi="Arial" w:cs="Arial"/>
@@ -490,6 +505,7 @@
                   </w:rPr>
                   <w:t>6,50</w:t>
                 </w:r>
+                <w:proofErr w:type="spellEnd"/>
               </w:p>
             </w:tc>
           </w:sdtContent>
@@ -522,6 +538,7 @@
                     <w:szCs w:val="28"/>
                   </w:rPr>
                 </w:pPr>
+                <w:proofErr w:type="spellStart"/>
                 <w:r>
                   <w:rPr>
                     <w:rFonts w:ascii="Arial" w:hAnsi="Arial" w:cs="Arial"/>
@@ -530,6 +547,7 @@
                   </w:rPr>
                   <w:t>Kuchen</w:t>
                 </w:r>
+                <w:proofErr w:type="spellEnd"/>
               </w:p>
             </w:tc>
           </w:sdtContent>
@@ -561,6 +579,7 @@
                     <w:szCs w:val="28"/>
                   </w:rPr>
                 </w:pPr>
+                <w:proofErr w:type="spellStart"/>
                 <w:r>
                   <w:rPr>
                     <w:rFonts w:ascii="Arial" w:hAnsi="Arial" w:cs="Arial"/>
@@ -569,6 +588,7 @@
                   </w:rPr>
                   <w:t>2,80</w:t>
                 </w:r>
+                <w:proofErr w:type="spellEnd"/>
               </w:p>
             </w:tc>
           </w:sdtContent>
@@ -601,6 +621,7 @@
                     <w:szCs w:val="28"/>
                   </w:rPr>
                 </w:pPr>
+                <w:proofErr w:type="spellStart"/>
                 <w:r>
                   <w:rPr>
                     <w:rFonts w:ascii="Arial" w:hAnsi="Arial" w:cs="Arial"/>
@@ -609,6 +630,7 @@
                   </w:rPr>
                   <w:t>Torten</w:t>
                 </w:r>
+                <w:proofErr w:type="spellEnd"/>
               </w:p>
             </w:tc>
           </w:sdtContent>
@@ -640,6 +662,7 @@
                     <w:szCs w:val="28"/>
                   </w:rPr>
                 </w:pPr>
+                <w:proofErr w:type="spellStart"/>
                 <w:r>
                   <w:rPr>
                     <w:rFonts w:ascii="Arial" w:hAnsi="Arial" w:cs="Arial"/>
@@ -648,6 +671,7 @@
                   </w:rPr>
                   <w:t>3,30</w:t>
                 </w:r>
+                <w:proofErr w:type="spellEnd"/>
               </w:p>
             </w:tc>
           </w:sdtContent>
@@ -680,6 +704,7 @@
                     <w:szCs w:val="28"/>
                   </w:rPr>
                 </w:pPr>
+                <w:proofErr w:type="spellStart"/>
                 <w:r>
                   <w:rPr>
                     <w:rFonts w:ascii="Arial" w:hAnsi="Arial" w:cs="Arial"/>
@@ -688,6 +713,7 @@
                   </w:rPr>
                   <w:t>Käsebrot</w:t>
                 </w:r>
+                <w:proofErr w:type="spellEnd"/>
               </w:p>
             </w:tc>
           </w:sdtContent>
@@ -719,6 +745,7 @@
                     <w:szCs w:val="28"/>
                   </w:rPr>
                 </w:pPr>
+                <w:proofErr w:type="spellStart"/>
                 <w:r>
                   <w:rPr>
                     <w:rFonts w:ascii="Arial" w:hAnsi="Arial" w:cs="Arial"/>
@@ -727,6 +754,7 @@
                   </w:rPr>
                   <w:t>7,00</w:t>
                 </w:r>
+                <w:proofErr w:type="spellEnd"/>
               </w:p>
             </w:tc>
           </w:sdtContent>
@@ -759,6 +787,7 @@
                     <w:szCs w:val="28"/>
                   </w:rPr>
                 </w:pPr>
+                <w:proofErr w:type="spellStart"/>
                 <w:r>
                   <w:rPr>
                     <w:rFonts w:ascii="Arial" w:hAnsi="Arial" w:cs="Arial"/>
@@ -767,6 +796,7 @@
                   </w:rPr>
                   <w:t>Tagesessen</w:t>
                 </w:r>
+                <w:proofErr w:type="spellEnd"/>
               </w:p>
             </w:tc>
           </w:sdtContent>
@@ -798,6 +828,7 @@
                     <w:szCs w:val="28"/>
                   </w:rPr>
                 </w:pPr>
+                <w:proofErr w:type="spellStart"/>
                 <w:r>
                   <w:rPr>
                     <w:rFonts w:ascii="Arial" w:hAnsi="Arial" w:cs="Arial"/>
@@ -806,6 +837,7 @@
                   </w:rPr>
                   <w:t>11,00</w:t>
                 </w:r>
+                <w:proofErr w:type="spellEnd"/>
               </w:p>
             </w:tc>
           </w:sdtContent>
@@ -838,6 +870,7 @@
                     <w:szCs w:val="28"/>
                   </w:rPr>
                 </w:pPr>
+                <w:proofErr w:type="spellStart"/>
                 <w:r>
                   <w:rPr>
                     <w:rFonts w:ascii="Arial" w:hAnsi="Arial" w:cs="Arial"/>
@@ -846,6 +879,7 @@
                   </w:rPr>
                   <w:t>Wurstsalat Standard</w:t>
                 </w:r>
+                <w:proofErr w:type="spellEnd"/>
               </w:p>
             </w:tc>
           </w:sdtContent>
@@ -877,6 +911,7 @@
                     <w:szCs w:val="28"/>
                   </w:rPr>
                 </w:pPr>
+                <w:proofErr w:type="spellStart"/>
                 <w:r>
                   <w:rPr>
                     <w:rFonts w:ascii="Arial" w:hAnsi="Arial" w:cs="Arial"/>
@@ -885,6 +920,7 @@
                   </w:rPr>
                   <w:t>9,00</w:t>
                 </w:r>
+                <w:proofErr w:type="spellEnd"/>
               </w:p>
             </w:tc>
           </w:sdtContent>
@@ -917,6 +953,7 @@
                     <w:szCs w:val="28"/>
                   </w:rPr>
                 </w:pPr>
+                <w:proofErr w:type="spellStart"/>
                 <w:r>
                   <w:rPr>
                     <w:rFonts w:ascii="Arial" w:hAnsi="Arial" w:cs="Arial"/>
@@ -925,6 +962,7 @@
                   </w:rPr>
                   <w:t>Wurstsalat Straßburger Art</w:t>
                 </w:r>
+                <w:proofErr w:type="spellEnd"/>
               </w:p>
             </w:tc>
           </w:sdtContent>
@@ -956,6 +994,7 @@
                     <w:szCs w:val="28"/>
                   </w:rPr>
                 </w:pPr>
+                <w:proofErr w:type="spellStart"/>
                 <w:r>
                   <w:rPr>
                     <w:rFonts w:ascii="Arial" w:hAnsi="Arial" w:cs="Arial"/>
@@ -964,6 +1003,7 @@
                   </w:rPr>
                   <w:t>9,50</w:t>
                 </w:r>
+                <w:proofErr w:type="spellEnd"/>
               </w:p>
             </w:tc>
           </w:sdtContent>
@@ -1334,12 +1374,14 @@
                     <w:rFonts w:ascii="Arial" w:hAnsi="Arial" w:cs="Arial"/>
                   </w:rPr>
                 </w:pPr>
+                <w:proofErr w:type="spellStart"/>
                 <w:r>
                   <w:rPr>
                     <w:rFonts w:ascii="Arial" w:hAnsi="Arial" w:cs="Arial"/>
                   </w:rPr>
                   <w:t>Ketterer Fläschle Export 0,3</w:t>
                 </w:r>
+                <w:proofErr w:type="spellEnd"/>
               </w:p>
             </w:tc>
           </w:sdtContent>
@@ -1369,12 +1411,14 @@
                     <w:rFonts w:ascii="Arial" w:hAnsi="Arial" w:cs="Arial"/>
                   </w:rPr>
                 </w:pPr>
+                <w:proofErr w:type="spellStart"/>
                 <w:r>
                   <w:rPr>
                     <w:rFonts w:ascii="Arial" w:hAnsi="Arial" w:cs="Arial"/>
                   </w:rPr>
                   <w:t>3,00</w:t>
                 </w:r>
+                <w:proofErr w:type="spellEnd"/>
               </w:p>
             </w:tc>
           </w:sdtContent>
@@ -1405,12 +1449,14 @@
                     <w:rFonts w:ascii="Arial" w:hAnsi="Arial" w:cs="Arial"/>
                   </w:rPr>
                 </w:pPr>
+                <w:proofErr w:type="spellStart"/>
                 <w:r>
                   <w:rPr>
                     <w:rFonts w:ascii="Arial" w:hAnsi="Arial" w:cs="Arial"/>
                   </w:rPr>
                   <w:t>Ketterer Fläschle Pils 0,3</w:t>
                 </w:r>
+                <w:proofErr w:type="spellEnd"/>
               </w:p>
             </w:tc>
           </w:sdtContent>
@@ -1440,12 +1486,14 @@
                     <w:rFonts w:ascii="Arial" w:hAnsi="Arial" w:cs="Arial"/>
                   </w:rPr>
                 </w:pPr>
+                <w:proofErr w:type="spellStart"/>
                 <w:r>
                   <w:rPr>
                     <w:rFonts w:ascii="Arial" w:hAnsi="Arial" w:cs="Arial"/>
                   </w:rPr>
                   <w:t>3,00</w:t>
                 </w:r>
+                <w:proofErr w:type="spellEnd"/>
               </w:p>
             </w:tc>
           </w:sdtContent>
@@ -1476,12 +1524,14 @@
                     <w:rFonts w:ascii="Arial" w:hAnsi="Arial" w:cs="Arial"/>
                   </w:rPr>
                 </w:pPr>
+                <w:proofErr w:type="spellStart"/>
                 <w:r>
                   <w:rPr>
                     <w:rFonts w:ascii="Arial" w:hAnsi="Arial" w:cs="Arial"/>
                   </w:rPr>
                   <w:t>Ketterer Weizen 0,5</w:t>
                 </w:r>
+                <w:proofErr w:type="spellEnd"/>
               </w:p>
             </w:tc>
           </w:sdtContent>
@@ -1511,12 +1561,14 @@
                     <w:rFonts w:ascii="Arial" w:hAnsi="Arial" w:cs="Arial"/>
                   </w:rPr>
                 </w:pPr>
+                <w:proofErr w:type="spellStart"/>
                 <w:r>
                   <w:rPr>
                     <w:rFonts w:ascii="Arial" w:hAnsi="Arial" w:cs="Arial"/>
                   </w:rPr>
                   <w:t>3,50</w:t>
                 </w:r>
+                <w:proofErr w:type="spellEnd"/>
               </w:p>
             </w:tc>
           </w:sdtContent>
@@ -1547,12 +1599,14 @@
                     <w:rFonts w:ascii="Arial" w:hAnsi="Arial" w:cs="Arial"/>
                   </w:rPr>
                 </w:pPr>
+                <w:proofErr w:type="spellStart"/>
                 <w:r>
                   <w:rPr>
                     <w:rFonts w:ascii="Arial" w:hAnsi="Arial" w:cs="Arial"/>
                   </w:rPr>
                   <w:t>Ketterer Weizen Radler 0,5</w:t>
                 </w:r>
+                <w:proofErr w:type="spellEnd"/>
               </w:p>
             </w:tc>
           </w:sdtContent>
@@ -1582,12 +1636,14 @@
                     <w:rFonts w:ascii="Arial" w:hAnsi="Arial" w:cs="Arial"/>
                   </w:rPr>
                 </w:pPr>
+                <w:proofErr w:type="spellStart"/>
                 <w:r>
                   <w:rPr>
                     <w:rFonts w:ascii="Arial" w:hAnsi="Arial" w:cs="Arial"/>
                   </w:rPr>
                   <w:t>3,00</w:t>
                 </w:r>
+                <w:proofErr w:type="spellEnd"/>
               </w:p>
             </w:tc>
           </w:sdtContent>
@@ -1618,12 +1674,14 @@
                     <w:rFonts w:ascii="Arial" w:hAnsi="Arial" w:cs="Arial"/>
                   </w:rPr>
                 </w:pPr>
+                <w:proofErr w:type="spellStart"/>
                 <w:r>
                   <w:rPr>
                     <w:rFonts w:ascii="Arial" w:hAnsi="Arial" w:cs="Arial"/>
                   </w:rPr>
                   <w:t>Ketterer Weizen alkoholfrei 0,5</w:t>
                 </w:r>
+                <w:proofErr w:type="spellEnd"/>
               </w:p>
             </w:tc>
           </w:sdtContent>
@@ -1653,12 +1711,14 @@
                     <w:rFonts w:ascii="Arial" w:hAnsi="Arial" w:cs="Arial"/>
                   </w:rPr>
                 </w:pPr>
+                <w:proofErr w:type="spellStart"/>
                 <w:r>
                   <w:rPr>
                     <w:rFonts w:ascii="Arial" w:hAnsi="Arial" w:cs="Arial"/>
                   </w:rPr>
                   <w:t>3,50</w:t>
                 </w:r>
+                <w:proofErr w:type="spellEnd"/>
               </w:p>
             </w:tc>
           </w:sdtContent>
@@ -1689,12 +1749,14 @@
                     <w:rFonts w:ascii="Arial" w:hAnsi="Arial" w:cs="Arial"/>
                   </w:rPr>
                 </w:pPr>
+                <w:proofErr w:type="spellStart"/>
                 <w:r>
                   <w:rPr>
                     <w:rFonts w:ascii="Arial" w:hAnsi="Arial" w:cs="Arial"/>
                   </w:rPr>
                   <w:t>Glas Sekt 0,1 l</w:t>
                 </w:r>
+                <w:proofErr w:type="spellEnd"/>
               </w:p>
             </w:tc>
           </w:sdtContent>
@@ -1724,12 +1786,14 @@
                     <w:rFonts w:ascii="Arial" w:hAnsi="Arial" w:cs="Arial"/>
                   </w:rPr>
                 </w:pPr>
+                <w:proofErr w:type="spellStart"/>
                 <w:r>
                   <w:rPr>
                     <w:rFonts w:ascii="Arial" w:hAnsi="Arial" w:cs="Arial"/>
                   </w:rPr>
                   <w:t>2,50</w:t>
                 </w:r>
+                <w:proofErr w:type="spellEnd"/>
               </w:p>
             </w:tc>
           </w:sdtContent>
@@ -1760,12 +1824,14 @@
                     <w:rFonts w:ascii="Arial" w:hAnsi="Arial" w:cs="Arial"/>
                   </w:rPr>
                 </w:pPr>
+                <w:proofErr w:type="spellStart"/>
                 <w:r>
                   <w:rPr>
                     <w:rFonts w:ascii="Arial" w:hAnsi="Arial" w:cs="Arial"/>
                   </w:rPr>
                   <w:t>Glas Wein 0,25 l (rot / weiß) – Rot</w:t>
                 </w:r>
+                <w:proofErr w:type="spellEnd"/>
               </w:p>
             </w:tc>
           </w:sdtContent>
@@ -1795,12 +1861,14 @@
                     <w:rFonts w:ascii="Arial" w:hAnsi="Arial" w:cs="Arial"/>
                   </w:rPr>
                 </w:pPr>
+                <w:proofErr w:type="spellStart"/>
                 <w:r>
                   <w:rPr>
                     <w:rFonts w:ascii="Arial" w:hAnsi="Arial" w:cs="Arial"/>
                   </w:rPr>
                   <w:t>4,00</w:t>
                 </w:r>
+                <w:proofErr w:type="spellEnd"/>
               </w:p>
             </w:tc>
           </w:sdtContent>
@@ -1831,12 +1899,14 @@
                     <w:rFonts w:ascii="Arial" w:hAnsi="Arial" w:cs="Arial"/>
                   </w:rPr>
                 </w:pPr>
+                <w:proofErr w:type="spellStart"/>
                 <w:r>
                   <w:rPr>
                     <w:rFonts w:ascii="Arial" w:hAnsi="Arial" w:cs="Arial"/>
                   </w:rPr>
                   <w:t>Heiße Schokolade</w:t>
                 </w:r>
+                <w:proofErr w:type="spellEnd"/>
               </w:p>
             </w:tc>
           </w:sdtContent>
@@ -1866,12 +1936,14 @@
                     <w:rFonts w:ascii="Arial" w:hAnsi="Arial" w:cs="Arial"/>
                   </w:rPr>
                 </w:pPr>
+                <w:proofErr w:type="spellStart"/>
                 <w:r>
                   <w:rPr>
                     <w:rFonts w:ascii="Arial" w:hAnsi="Arial" w:cs="Arial"/>
                   </w:rPr>
                   <w:t>3,50</w:t>
                 </w:r>
+                <w:proofErr w:type="spellEnd"/>
               </w:p>
             </w:tc>
           </w:sdtContent>
@@ -1902,12 +1974,14 @@
                     <w:rFonts w:ascii="Arial" w:hAnsi="Arial" w:cs="Arial"/>
                   </w:rPr>
                 </w:pPr>
+                <w:proofErr w:type="spellStart"/>
                 <w:r>
                   <w:rPr>
                     <w:rFonts w:ascii="Arial" w:hAnsi="Arial" w:cs="Arial"/>
                   </w:rPr>
                   <w:t>Cappuccino</w:t>
                 </w:r>
+                <w:proofErr w:type="spellEnd"/>
               </w:p>
             </w:tc>
           </w:sdtContent>
@@ -1937,12 +2011,14 @@
                     <w:rFonts w:ascii="Arial" w:hAnsi="Arial" w:cs="Arial"/>
                   </w:rPr>
                 </w:pPr>
+                <w:proofErr w:type="spellStart"/>
                 <w:r>
                   <w:rPr>
                     <w:rFonts w:ascii="Arial" w:hAnsi="Arial" w:cs="Arial"/>
                   </w:rPr>
                   <w:t>3,50</w:t>
                 </w:r>
+                <w:proofErr w:type="spellEnd"/>
               </w:p>
             </w:tc>
           </w:sdtContent>
@@ -1973,12 +2049,14 @@
                     <w:rFonts w:ascii="Arial" w:hAnsi="Arial" w:cs="Arial"/>
                   </w:rPr>
                 </w:pPr>
+                <w:proofErr w:type="spellStart"/>
                 <w:r>
                   <w:rPr>
                     <w:rFonts w:ascii="Arial" w:hAnsi="Arial" w:cs="Arial"/>
                   </w:rPr>
                   <w:t>Espresso Einfach</w:t>
                 </w:r>
+                <w:proofErr w:type="spellEnd"/>
               </w:p>
             </w:tc>
           </w:sdtContent>
@@ -2008,12 +2086,14 @@
                     <w:rFonts w:ascii="Arial" w:hAnsi="Arial" w:cs="Arial"/>
                   </w:rPr>
                 </w:pPr>
+                <w:proofErr w:type="spellStart"/>
                 <w:r>
                   <w:rPr>
                     <w:rFonts w:ascii="Arial" w:hAnsi="Arial" w:cs="Arial"/>
                   </w:rPr>
                   <w:t>2,50</w:t>
                 </w:r>
+                <w:proofErr w:type="spellEnd"/>
               </w:p>
             </w:tc>
           </w:sdtContent>
@@ -2044,12 +2124,14 @@
                     <w:rFonts w:ascii="Arial" w:hAnsi="Arial" w:cs="Arial"/>
                   </w:rPr>
                 </w:pPr>
+                <w:proofErr w:type="spellStart"/>
                 <w:r>
                   <w:rPr>
                     <w:rFonts w:ascii="Arial" w:hAnsi="Arial" w:cs="Arial"/>
                   </w:rPr>
                   <w:t>Kaffee Groß mit Milch und Zucker</w:t>
                 </w:r>
+                <w:proofErr w:type="spellEnd"/>
               </w:p>
             </w:tc>
           </w:sdtContent>
@@ -2079,12 +2161,14 @@
                     <w:rFonts w:ascii="Arial" w:hAnsi="Arial" w:cs="Arial"/>
                   </w:rPr>
                 </w:pPr>
+                <w:proofErr w:type="spellStart"/>
                 <w:r>
                   <w:rPr>
                     <w:rFonts w:ascii="Arial" w:hAnsi="Arial" w:cs="Arial"/>
                   </w:rPr>
                   <w:t>3,00</w:t>
                 </w:r>
+                <w:proofErr w:type="spellEnd"/>
               </w:p>
             </w:tc>
           </w:sdtContent>
@@ -2115,12 +2199,14 @@
                     <w:rFonts w:ascii="Arial" w:hAnsi="Arial" w:cs="Arial"/>
                   </w:rPr>
                 </w:pPr>
+                <w:proofErr w:type="spellStart"/>
                 <w:r>
                   <w:rPr>
                     <w:rFonts w:ascii="Arial" w:hAnsi="Arial" w:cs="Arial"/>
                   </w:rPr>
                   <w:t>Kaffee Klein mit Milch und Zucker</w:t>
                 </w:r>
+                <w:proofErr w:type="spellEnd"/>
               </w:p>
             </w:tc>
           </w:sdtContent>
@@ -2150,12 +2236,14 @@
                     <w:rFonts w:ascii="Arial" w:hAnsi="Arial" w:cs="Arial"/>
                   </w:rPr>
                 </w:pPr>
+                <w:proofErr w:type="spellStart"/>
                 <w:r>
                   <w:rPr>
                     <w:rFonts w:ascii="Arial" w:hAnsi="Arial" w:cs="Arial"/>
                   </w:rPr>
                   <w:t>2,00</w:t>
                 </w:r>
+                <w:proofErr w:type="spellEnd"/>
               </w:p>
             </w:tc>
           </w:sdtContent>
@@ -2186,12 +2274,14 @@
                     <w:rFonts w:ascii="Arial" w:hAnsi="Arial" w:cs="Arial"/>
                   </w:rPr>
                 </w:pPr>
+                <w:proofErr w:type="spellStart"/>
                 <w:r>
                   <w:rPr>
                     <w:rFonts w:ascii="Arial" w:hAnsi="Arial" w:cs="Arial"/>
                   </w:rPr>
                   <w:t>Latte Macchiato</w:t>
                 </w:r>
+                <w:proofErr w:type="spellEnd"/>
               </w:p>
             </w:tc>
           </w:sdtContent>
@@ -2221,12 +2311,14 @@
                     <w:rFonts w:ascii="Arial" w:hAnsi="Arial" w:cs="Arial"/>
                   </w:rPr>
                 </w:pPr>
+                <w:proofErr w:type="spellStart"/>
                 <w:r>
                   <w:rPr>
                     <w:rFonts w:ascii="Arial" w:hAnsi="Arial" w:cs="Arial"/>
                   </w:rPr>
                   <w:t>3,50</w:t>
                 </w:r>
+                <w:proofErr w:type="spellEnd"/>
               </w:p>
             </w:tc>
           </w:sdtContent>
@@ -2257,12 +2349,14 @@
                     <w:rFonts w:ascii="Arial" w:hAnsi="Arial" w:cs="Arial"/>
                   </w:rPr>
                 </w:pPr>
+                <w:proofErr w:type="spellStart"/>
                 <w:r>
                   <w:rPr>
                     <w:rFonts w:ascii="Arial" w:hAnsi="Arial" w:cs="Arial"/>
                   </w:rPr>
                   <w:t>Milchkaffee</w:t>
                 </w:r>
+                <w:proofErr w:type="spellEnd"/>
               </w:p>
             </w:tc>
           </w:sdtContent>
@@ -2292,12 +2386,14 @@
                     <w:rFonts w:ascii="Arial" w:hAnsi="Arial" w:cs="Arial"/>
                   </w:rPr>
                 </w:pPr>
+                <w:proofErr w:type="spellStart"/>
                 <w:r>
                   <w:rPr>
                     <w:rFonts w:ascii="Arial" w:hAnsi="Arial" w:cs="Arial"/>
                   </w:rPr>
                   <w:t>3,50</w:t>
                 </w:r>
+                <w:proofErr w:type="spellEnd"/>
               </w:p>
             </w:tc>
           </w:sdtContent>
@@ -2328,12 +2424,14 @@
                     <w:rFonts w:ascii="Arial" w:hAnsi="Arial" w:cs="Arial"/>
                   </w:rPr>
                 </w:pPr>
+                <w:proofErr w:type="spellStart"/>
                 <w:r>
                   <w:rPr>
                     <w:rFonts w:ascii="Arial" w:hAnsi="Arial" w:cs="Arial"/>
                   </w:rPr>
                   <w:t>Apfelsaft 0,5</w:t>
                 </w:r>
+                <w:proofErr w:type="spellEnd"/>
               </w:p>
             </w:tc>
           </w:sdtContent>
@@ -2363,12 +2461,14 @@
                     <w:rFonts w:ascii="Arial" w:hAnsi="Arial" w:cs="Arial"/>
                   </w:rPr>
                 </w:pPr>
+                <w:proofErr w:type="spellStart"/>
                 <w:r>
                   <w:rPr>
                     <w:rFonts w:ascii="Arial" w:hAnsi="Arial" w:cs="Arial"/>
                   </w:rPr>
                   <w:t>3,00</w:t>
                 </w:r>
+                <w:proofErr w:type="spellEnd"/>
               </w:p>
             </w:tc>
           </w:sdtContent>
@@ -2399,12 +2499,14 @@
                     <w:rFonts w:ascii="Arial" w:hAnsi="Arial" w:cs="Arial"/>
                   </w:rPr>
                 </w:pPr>
+                <w:proofErr w:type="spellStart"/>
                 <w:r>
                   <w:rPr>
                     <w:rFonts w:ascii="Arial" w:hAnsi="Arial" w:cs="Arial"/>
                   </w:rPr>
                   <w:t>Johannesbeerschorle 0,5</w:t>
                 </w:r>
+                <w:proofErr w:type="spellEnd"/>
               </w:p>
             </w:tc>
           </w:sdtContent>
@@ -2434,12 +2536,14 @@
                     <w:rFonts w:ascii="Arial" w:hAnsi="Arial" w:cs="Arial"/>
                   </w:rPr>
                 </w:pPr>
+                <w:proofErr w:type="spellStart"/>
                 <w:r>
                   <w:rPr>
                     <w:rFonts w:ascii="Arial" w:hAnsi="Arial" w:cs="Arial"/>
                   </w:rPr>
                   <w:t>3,00</w:t>
                 </w:r>
+                <w:proofErr w:type="spellEnd"/>
               </w:p>
             </w:tc>
           </w:sdtContent>
@@ -2470,12 +2574,14 @@
                     <w:rFonts w:ascii="Arial" w:hAnsi="Arial" w:cs="Arial"/>
                   </w:rPr>
                 </w:pPr>
+                <w:proofErr w:type="spellStart"/>
                 <w:r>
                   <w:rPr>
                     <w:rFonts w:ascii="Arial" w:hAnsi="Arial" w:cs="Arial"/>
                   </w:rPr>
                   <w:t>Paulaner Spezi 0,5</w:t>
                 </w:r>
+                <w:proofErr w:type="spellEnd"/>
               </w:p>
             </w:tc>
           </w:sdtContent>
@@ -2505,12 +2611,14 @@
                     <w:rFonts w:ascii="Arial" w:hAnsi="Arial" w:cs="Arial"/>
                   </w:rPr>
                 </w:pPr>
+                <w:proofErr w:type="spellStart"/>
                 <w:r>
                   <w:rPr>
                     <w:rFonts w:ascii="Arial" w:hAnsi="Arial" w:cs="Arial"/>
                   </w:rPr>
                   <w:t>3,00</w:t>
                 </w:r>
+                <w:proofErr w:type="spellEnd"/>
               </w:p>
             </w:tc>
           </w:sdtContent>
@@ -2541,12 +2649,14 @@
                     <w:rFonts w:ascii="Arial" w:hAnsi="Arial" w:cs="Arial"/>
                   </w:rPr>
                 </w:pPr>
+                <w:proofErr w:type="spellStart"/>
                 <w:r>
                   <w:rPr>
                     <w:rFonts w:ascii="Arial" w:hAnsi="Arial" w:cs="Arial"/>
                   </w:rPr>
                   <w:t>Schnaps / Likör – Kirschwasser</w:t>
                 </w:r>
+                <w:proofErr w:type="spellEnd"/>
               </w:p>
             </w:tc>
           </w:sdtContent>
@@ -2576,12 +2686,14 @@
                     <w:rFonts w:ascii="Arial" w:hAnsi="Arial" w:cs="Arial"/>
                   </w:rPr>
                 </w:pPr>
+                <w:proofErr w:type="spellStart"/>
                 <w:r>
                   <w:rPr>
                     <w:rFonts w:ascii="Arial" w:hAnsi="Arial" w:cs="Arial"/>
                   </w:rPr>
                   <w:t>2,00</w:t>
                 </w:r>
+                <w:proofErr w:type="spellEnd"/>
               </w:p>
             </w:tc>
           </w:sdtContent>
@@ -2612,12 +2724,14 @@
                     <w:rFonts w:ascii="Arial" w:hAnsi="Arial" w:cs="Arial"/>
                   </w:rPr>
                 </w:pPr>
+                <w:proofErr w:type="spellStart"/>
                 <w:r>
                   <w:rPr>
                     <w:rFonts w:ascii="Arial" w:hAnsi="Arial" w:cs="Arial"/>
                   </w:rPr>
                   <w:t>Wasser (Classic, Medium, Still) – 0,5 l Classic</w:t>
                 </w:r>
+                <w:proofErr w:type="spellEnd"/>
               </w:p>
             </w:tc>
           </w:sdtContent>
@@ -2647,12 +2761,14 @@
                     <w:rFonts w:ascii="Arial" w:hAnsi="Arial" w:cs="Arial"/>
                   </w:rPr>
                 </w:pPr>
+                <w:proofErr w:type="spellStart"/>
                 <w:r>
                   <w:rPr>
                     <w:rFonts w:ascii="Arial" w:hAnsi="Arial" w:cs="Arial"/>
                   </w:rPr>
                   <w:t>2,50</w:t>
                 </w:r>
+                <w:proofErr w:type="spellEnd"/>
               </w:p>
             </w:tc>
           </w:sdtContent>
@@ -2683,12 +2799,14 @@
                     <w:rFonts w:ascii="Arial" w:hAnsi="Arial" w:cs="Arial"/>
                   </w:rPr>
                 </w:pPr>
+                <w:proofErr w:type="spellStart"/>
                 <w:r>
                   <w:rPr>
                     <w:rFonts w:ascii="Arial" w:hAnsi="Arial" w:cs="Arial"/>
                   </w:rPr>
                   <w:t>Weinschorle 0,25 l (rot, weiß) – Rot sauer</w:t>
                 </w:r>
+                <w:proofErr w:type="spellEnd"/>
               </w:p>
             </w:tc>
           </w:sdtContent>
@@ -2718,12 +2836,14 @@
                     <w:rFonts w:ascii="Arial" w:hAnsi="Arial" w:cs="Arial"/>
                   </w:rPr>
                 </w:pPr>
+                <w:proofErr w:type="spellStart"/>
                 <w:r>
                   <w:rPr>
                     <w:rFonts w:ascii="Arial" w:hAnsi="Arial" w:cs="Arial"/>
                   </w:rPr>
                   <w:t>3,00</w:t>
                 </w:r>
+                <w:proofErr w:type="spellEnd"/>
               </w:p>
             </w:tc>
           </w:sdtContent>
@@ -2932,17 +3052,6 @@
   <w:p>
     <w:pPr>
       <w:pStyle w:val="Fuzeile"/>
-      <w:ind w:left="2211"/>
-      <w:rPr>
-        <w:sz w:val="20"/>
-        <w:szCs w:val="20"/>
-      </w:rPr>
-    </w:pPr>
-  </w:p>
-  <w:p>
-    <w:pPr>
-      <w:pStyle w:val="Fuzeile"/>
-      <w:ind w:left="2211"/>
       <w:rPr>
         <w:rFonts w:ascii="Arial" w:hAnsi="Arial" w:cs="Arial"/>
         <w:sz w:val="18"/>
@@ -2951,11 +3060,10 @@
     </w:pPr>
     <w:r>
       <w:rPr>
-        <w:rFonts w:ascii="Arial" w:hAnsi="Arial" w:cs="Arial"/>
-        <w:sz w:val="18"/>
-        <w:szCs w:val="18"/>
+        <w:sz w:val="20"/>
+        <w:szCs w:val="20"/>
       </w:rPr>
-      <w:t xml:space="preserve">  </w:t>
+      <w:t xml:space="preserve">                                           </w:t>
     </w:r>
     <w:r>
       <w:rPr>
@@ -4185,10 +4293,12 @@
     <w:rsid w:val="00B503B8"/>
     <w:rsid w:val="00B72CB0"/>
     <w:rsid w:val="00B7400A"/>
+    <w:rsid w:val="00B87C4E"/>
     <w:rsid w:val="00BC11A9"/>
     <w:rsid w:val="00BE2B47"/>
     <w:rsid w:val="00BF71FB"/>
     <w:rsid w:val="00C73DD6"/>
+    <w:rsid w:val="00D33966"/>
     <w:rsid w:val="00D82F80"/>
     <w:rsid w:val="00DA4DC0"/>
     <w:rsid w:val="00DB574B"/>

</xml_diff>